<commit_message>
1.1.6-rasm namunasi: Correia, Luck, Verner (2026) bo‘yicha AQSh 1959–2024 AUC
Co-Authored-By: Claude Opus 5.5 <noreply@anthropic.com>
Claude-Session: https://claude.ai/code/session_01PxHTC8Q7yHdrpAeUA5KUgM
</commit_message>
<xml_diff>
--- a/Namuna_1.1.6-rasm_yangi.docx
+++ b/Namuna_1.1.6-rasm_yangi.docx
@@ -28,7 +28,7 @@
           <w:color w:val="595959"/>
           <w:sz w:val="24"/>
         </w:rPr>
-        <w:t>Ma’qul bo‘lsa: 1.1-§ dagi “Bu ko‘rsatkichning amaliy samaradorligini L. Chiaramonte va F. Poli tadqiqoti yaqqol tasdiqlaydi (1.1.6-rasm).” jumlasi quyidagi birinchi xatboshi bilan, 1.1.6-rasm va undan keyingi “Mualliflar 12 mamlakatdagi …” xatboshi esa quyidagi rasm va tahlil bilan almashtiriladi.</w:t>
+        <w:t>Ma’qul bo‘lsa: 1.1-§ dagi “Bu ko‘rsatkichning amaliy samaradorligini L. Chiaramonte va F. Poli tadqiqoti yaqqol tasdiqlaydi (1.1.6-rasm).” jumlasi quyidagi birinchi jumla bilan, 1.1.6-rasm va undan keyingi “Mualliflar 12 mamlakatdagi …” xatboshi esa quyidagi rasm va tahlil bilan almashtiriladi.</w:t>
       </w:r>
     </w:p>
     <w:p>
@@ -42,7 +42,7 @@
           <w:i w:val="0"/>
           <w:sz w:val="28"/>
         </w:rPr>
-        <w:t>… Bu ko‘rsatkichning amaliy samaradorligini L. Chiaramonte va F. Poli tadqiqoti tasdiqlaydi: ular 12 mamlakatdagi 3125 ta bankning 2001–2011-yillardagi ma’lumotlari asosida faqat Z-score ko‘rsatkichining o‘zi muammoga uchragan banklarning 75 foizini, sog‘lom banklarning esa 81 foizini to‘g‘ri aniqlaganini ko‘rsatgan[1]. Biroq O‘zbekiston bank tizimining 2021–2025-yillardagi ma’lumotlari bu xulosani tasdiqlamaydi (1.1.6-rasm).</w:t>
+        <w:t>… Bu ko‘rsatkich tarkibiy qismlarining amaliy samaradorligini S. Korreya, S. Lak va E. Verner tadqiqoti yaqqol tasdiqlaydi (1.1.6-rasm).</w:t>
       </w:r>
     </w:p>
     <w:p>
@@ -79,7 +79,7 @@
           <w:i w:val="0"/>
           <w:sz w:val="28"/>
         </w:rPr>
-        <w:t>1.1.6-rasm. Z-score ko‘rsatkichi va integral indeksning O‘zbekiston tijorat banklari muammolarini bashorat qilish aniqligi, 2021–2025-yillar, %[2]</w:t>
+        <w:t>1.1.6-rasm. Buxgalteriya ko‘rsatkichlariga asoslangan modellarning AQSh banklari faoliyati to‘xtatilishini bashorat qilish aniqligi (AUC), 1959–2024-yillar[1]</w:t>
       </w:r>
     </w:p>
     <w:p>
@@ -93,7 +93,7 @@
           <w:i w:val="0"/>
           <w:sz w:val="28"/>
         </w:rPr>
-        <w:t>Rasm ma’lumotlari shuni ko‘rsatadiki, O‘zbekiston banklarida faqat Z-score ko‘rsatkichining o‘zi muammoga uchragan banklarning 50 foizini, sog‘lom banklarning 69 foizini to‘g‘ri aniqlaydi, ya’ni uning bashorat kuchi tasodifiy tasniflashdan deyarli farq qilmaydi. Logit modelida ham Z-score logarifmi statistik ahamiyatsiz (p = 0,19), integral indeksga qo‘shilganda esa uning bashorat kuchini oshirmaydi (p = 0,74). 3.1-paragrafda taklif etilgan integral indeks esa xuddi shu ma’lumotlarda muammoli banklarning 100 foizini, sog‘lom banklarning 78 foizini to‘g‘ri aniqlaydi. Bu farqning sababi shundaki, O‘zbekiston banklarida, ayniqsa davlat ishtirokidagi banklarda, kapitalning aktivlarga nisbati davlat tomonidan kapitallashtirish hisobiga yuqori saqlanadi, aktivlar sifatidagi muammolar esa aktivlar rentabelligi o‘zgaruvchanligida kechikib aks etadi. Natijada faqat kapital va rentabellikka asoslangan Z-score yashirin kredit riskini sezmaydi. Bundan kelib chiqadiki, aksiyalar bozori rivojlanmagan O‘zbekiston sharoitida buxgalteriya ma’lumotlariga asoslangan baholash bitta ko‘rsatkich bilan cheklanmasligi, balki aktivlar sifati blokini o‘z ichiga olgan integral baholash usuliga tayanishi lozim.</w:t>
+        <w:t>Mualliflar AQShning 1959–2024-yillardagi 23 mingdan ortiq banki ma’lumotlari asosida faqat sof foydaning aktivlarga nisbati, ya’ni Z-score ning rentabellik tarkibiy qismi banklar faoliyatining bir yil ichida to‘xtatilishini 0,95 AUC bilan bashorat qilishini, bu aniqlik model baholanishida foydalanilmagan keyingi davrlarda ham 0,94 darajasida saqlanishini ko‘rsatgan. Noasosiy moliyalashtirish ulushining o‘zi kamroq aniqlik beradi (0,85), ikkala ko‘rsatkich birgalikda esa eng yuqori natijaga erishadi (0,95). Mualliflar hisob-kitobiga ko‘ra, noto‘g‘ri signallar ulushi 10 foiz bo‘lganda faoliyati to‘xtatilgan banklarning 92 foizini oldindan aniqlash mumkin[2]. Tadqiqot xulosasiga ko‘ra, banklar faoliyatining to‘xtatilishi ochiq moliyaviy hisobotlardagi oddiy buxgalteriya ko‘rsatkichlari yordamida yuqori aniqlikda bashorat qilinadi. Bu xulosa aksiyalar bozori rivojlanmagan O‘zbekiston sharoitida buxgalteriya ma’lumotlariga asoslangan integral baholash usullarining afzalligini asoslaydi.</w:t>
       </w:r>
     </w:p>
     <w:p>
@@ -121,7 +121,7 @@
           <w:i w:val="0"/>
           <w:sz w:val="22"/>
         </w:rPr>
-        <w:t>[1] Chiaramonte L., Poli F. Predicting European Bank Distress: Evidence from the Recent Financial Crisis // Governance, Regulation and Bank Stability / ed. by T. Lindblom, S. Sjögren, M. Willesson. – Basingstoke: Palgrave Macmillan, 2014. – P. 83–95.</w:t>
+        <w:t>[1] Tadqiqot natijasida muallif tomonidan quyidagi manba ma’lumotlari asosida ishlab chiqildi: Correia S., Luck S., Verner E. Failing Banks // Quarterly Journal of Economics. – 2026. – Vol. 141, No. 1. – P. 147–204; ishchi varianti: arXiv:2506.06082. – 2025 – P. 30. Izoh: AUC – ROC egri chizig‘i ostidagi maydon (0,5 – tasodifiy bashorat, 1,0 – mukammal bashorat); bashorat ufqi – bir yil.</w:t>
       </w:r>
     </w:p>
     <w:p>
@@ -135,7 +135,7 @@
           <w:i w:val="0"/>
           <w:sz w:val="22"/>
         </w:rPr>
-        <w:t>[2] Tadqiqot natijasida muallif tomonidan 25 ta tijorat bankining 2021–2025-yillardagi choraklik hisobotlari asosida hisoblandi (214 ta kuzatuv, 18 ta muammo hodisasi). Muammo hodisasi – keyingi to‘rt chorak ichida choraklik zararning kapitalning 5 foizidan oshishi (4.1-§); Z-score aktivlar rentabelligining sakkiz chorak bo‘yicha standart og‘ishi asosida hisoblangani sababli kuzatuvlar 2022-yil IV choragidan boshlanadi; har bir model uchun chegaraviy qiymat Youden mezoni bo‘yicha tanlangan.</w:t>
+        <w:t>[2] Correia S., Luck S., Verner E. Failing Banks // Quarterly Journal of Economics. – 2026. – Vol. 141, No. 1. – P. 147–204; ishchi varianti: arXiv:2506.06082. – 2025 – P. 1, 30–31.</w:t>
       </w:r>
     </w:p>
     <w:sectPr>
@@ -24028,7 +24028,7 @@
               <c:strCache>
                 <c:ptCount val="1"/>
                 <c:pt idx="0">
-                  <c:v>Muammoli banklar to‘g‘ri aniqlangan</c:v>
+                  <c:v>Model baholangan ma’lumotlarda</c:v>
                 </c:pt>
               </c:strCache>
             </c:strRef>
@@ -24045,7 +24045,7 @@
           </c:spPr>
           <c:invertIfNegative val="0"/>
           <c:dLbls>
-            <c:numFmt formatCode="0" sourceLinked="0"/>
+            <c:numFmt formatCode="0.00" sourceLinked="0"/>
             <c:spPr>
               <a:noFill/>
               <a:ln>
@@ -24078,35 +24078,44 @@
           </c:dLbls>
           <c:cat>
             <c:strRef>
-              <c:f>Sheet1!$A$2:$A$4</c:f>
+              <c:f>Sheet1!$A$2:$A$5</c:f>
               <c:strCache>
-                <c:ptCount val="3"/>
+                <c:ptCount val="4"/>
                 <c:pt idx="0">
-                  <c:v>Faqat Z-score</c:v>
+                  <c:v>Faqat sof foyda /
+aktivlar</c:v>
                 </c:pt>
                 <c:pt idx="1">
-                  <c:v>Integral indeks (MBII)</c:v>
+                  <c:v>Faqat noasosiy
+moliyalashtirish</c:v>
                 </c:pt>
                 <c:pt idx="2">
-                  <c:v>MBII + Z-score</c:v>
+                  <c:v>Ikkala ko‘rsatkich
+birgalikda</c:v>
+                </c:pt>
+                <c:pt idx="3">
+                  <c:v>To‘liq model</c:v>
                 </c:pt>
               </c:strCache>
             </c:strRef>
           </c:cat>
           <c:val>
             <c:numRef>
-              <c:f>Sheet1!$B$2:$B$4</c:f>
+              <c:f>Sheet1!$B$2:$B$5</c:f>
               <c:numCache>
                 <c:formatCode>General</c:formatCode>
-                <c:ptCount val="3"/>
+                <c:ptCount val="4"/>
                 <c:pt idx="0">
-                  <c:v>50</c:v>
+                  <c:v>0.949</c:v>
                 </c:pt>
                 <c:pt idx="1">
-                  <c:v>100</c:v>
+                  <c:v>0.846</c:v>
                 </c:pt>
                 <c:pt idx="2">
-                  <c:v>100</c:v>
+                  <c:v>0.954</c:v>
+                </c:pt>
+                <c:pt idx="3">
+                  <c:v>0.953</c:v>
                 </c:pt>
               </c:numCache>
             </c:numRef>
@@ -24121,7 +24130,7 @@
               <c:strCache>
                 <c:ptCount val="1"/>
                 <c:pt idx="0">
-                  <c:v>Sog‘lom banklar to‘g‘ri aniqlangan</c:v>
+                  <c:v>Keyingi davrlarda (tanlanmadan tashqari)</c:v>
                 </c:pt>
               </c:strCache>
             </c:strRef>
@@ -24138,7 +24147,7 @@
           </c:spPr>
           <c:invertIfNegative val="0"/>
           <c:dLbls>
-            <c:numFmt formatCode="0" sourceLinked="0"/>
+            <c:numFmt formatCode="0.00" sourceLinked="0"/>
             <c:spPr>
               <a:noFill/>
               <a:ln>
@@ -24171,35 +24180,44 @@
           </c:dLbls>
           <c:cat>
             <c:strRef>
-              <c:f>Sheet1!$A$2:$A$4</c:f>
+              <c:f>Sheet1!$A$2:$A$5</c:f>
               <c:strCache>
-                <c:ptCount val="3"/>
+                <c:ptCount val="4"/>
                 <c:pt idx="0">
-                  <c:v>Faqat Z-score</c:v>
+                  <c:v>Faqat sof foyda /
+aktivlar</c:v>
                 </c:pt>
                 <c:pt idx="1">
-                  <c:v>Integral indeks (MBII)</c:v>
+                  <c:v>Faqat noasosiy
+moliyalashtirish</c:v>
                 </c:pt>
                 <c:pt idx="2">
-                  <c:v>MBII + Z-score</c:v>
+                  <c:v>Ikkala ko‘rsatkich
+birgalikda</c:v>
+                </c:pt>
+                <c:pt idx="3">
+                  <c:v>To‘liq model</c:v>
                 </c:pt>
               </c:strCache>
             </c:strRef>
           </c:cat>
           <c:val>
             <c:numRef>
-              <c:f>Sheet1!$C$2:$C$4</c:f>
+              <c:f>Sheet1!$C$2:$C$5</c:f>
               <c:numCache>
                 <c:formatCode>General</c:formatCode>
-                <c:ptCount val="3"/>
+                <c:ptCount val="4"/>
                 <c:pt idx="0">
-                  <c:v>69</c:v>
+                  <c:v>0.942</c:v>
                 </c:pt>
                 <c:pt idx="1">
-                  <c:v>78</c:v>
+                  <c:v>0.792</c:v>
                 </c:pt>
                 <c:pt idx="2">
-                  <c:v>78</c:v>
+                  <c:v>0.946</c:v>
+                </c:pt>
+                <c:pt idx="3">
+                  <c:v>0.945</c:v>
                 </c:pt>
               </c:numCache>
             </c:numRef>
@@ -24255,8 +24273,8 @@
         <c:axId val="222"/>
         <c:scaling>
           <c:orientation val="minMax"/>
-          <c:max val="100"/>
-          <c:min val="0"/>
+          <c:max val="1.0"/>
+          <c:min val="0.5"/>
         </c:scaling>
         <c:delete val="0"/>
         <c:axPos val="l"/>
@@ -24291,14 +24309,14 @@
                     </a:solidFill>
                     <a:latin typeface="Times New Roman"/>
                   </a:rPr>
-                  <a:t>To‘g‘ri tasniflash ulushi, %</a:t>
+                  <a:t>AUC</a:t>
                 </a:r>
               </a:p>
             </c:rich>
           </c:tx>
           <c:overlay val="0"/>
         </c:title>
-        <c:numFmt formatCode="General" sourceLinked="0"/>
+        <c:numFmt formatCode="0.0" sourceLinked="0"/>
         <c:majorTickMark val="out"/>
         <c:minorTickMark val="none"/>
         <c:tickLblPos val="low"/>
@@ -24328,7 +24346,7 @@
         <c:crossAx val="111"/>
         <c:crosses val="autoZero"/>
         <c:crossBetween val="between"/>
-        <c:majorUnit val="20"/>
+        <c:majorUnit val="0.1"/>
       </c:valAx>
       <c:spPr>
         <a:noFill/>

</xml_diff>